<commit_message>
new credit line page
</commit_message>
<xml_diff>
--- a/resources/HK_AT_Clinical_Resource_Copyright_Page.docx
+++ b/resources/HK_AT_Clinical_Resource_Copyright_Page.docx
@@ -185,7 +185,25 @@
           <w:sz w:val="24"/>
           <w:szCs w:val="24"/>
         </w:rPr>
-        <w:t xml:space="preserve"> is granted to persons and agencies who have purchased </w:t>
+        <w:t xml:space="preserve"> is granted to </w:t>
+      </w:r>
+      <w:proofErr w:type="gramStart"/>
+      <w:r>
+        <w:rPr>
+          <w:rFonts w:ascii="Aptos" w:hAnsi="Aptos" w:cstheme="minorHAnsi"/>
+          <w:sz w:val="24"/>
+          <w:szCs w:val="24"/>
+        </w:rPr>
+        <w:t>persons</w:t>
+      </w:r>
+      <w:proofErr w:type="gramEnd"/>
+      <w:r>
+        <w:rPr>
+          <w:rFonts w:ascii="Aptos" w:hAnsi="Aptos" w:cstheme="minorHAnsi"/>
+          <w:sz w:val="24"/>
+          <w:szCs w:val="24"/>
+        </w:rPr>
+        <w:t xml:space="preserve"> and agencies who have purchased </w:t>
       </w:r>
       <w:r>
         <w:rPr>
@@ -336,7 +354,25 @@
           <w:sz w:val="24"/>
           <w:szCs w:val="24"/>
         </w:rPr>
-        <w:t>L1903 HK_Prod TM Credit Lines_updated</w:t>
+        <w:t xml:space="preserve">L1903 </w:t>
+      </w:r>
+      <w:proofErr w:type="spellStart"/>
+      <w:r>
+        <w:rPr>
+          <w:rFonts w:ascii="Aptos" w:hAnsi="Aptos" w:cstheme="minorHAnsi"/>
+          <w:sz w:val="24"/>
+          <w:szCs w:val="24"/>
+        </w:rPr>
+        <w:t>HK_Prod</w:t>
+      </w:r>
+      <w:proofErr w:type="spellEnd"/>
+      <w:r>
+        <w:rPr>
+          <w:rFonts w:ascii="Aptos" w:hAnsi="Aptos" w:cstheme="minorHAnsi"/>
+          <w:sz w:val="24"/>
+          <w:szCs w:val="24"/>
+        </w:rPr>
+        <w:t xml:space="preserve"> TM Credit Lines</w:t>
       </w:r>
       <w:r>
         <w:rPr>

</xml_diff>